<commit_message>
Add corrected deprivation analysis and NHS DNA Story Deck
</commit_message>
<xml_diff>
--- a/outputs/GP DNA Portfolio Case Study.docx
+++ b/outputs/GP DNA Portfolio Case Study.docx
@@ -334,14 +334,7 @@
                 <w:sz w:val="20"/>
                 <w:szCs w:val="20"/>
               </w:rPr>
-              <w:t>202</w:t>
-            </w:r>
-            <w:r>
-              <w:rPr>
-                <w:sz w:val="20"/>
-                <w:szCs w:val="20"/>
-              </w:rPr>
-              <w:t>6</w:t>
+              <w:t>2026</w:t>
             </w:r>
           </w:p>
         </w:tc>
@@ -400,21 +393,7 @@
                 <w:sz w:val="20"/>
                 <w:szCs w:val="20"/>
               </w:rPr>
-              <w:t xml:space="preserve">SQL </w:t>
-            </w:r>
-            <w:r>
-              <w:rPr>
-                <w:sz w:val="20"/>
-                <w:szCs w:val="20"/>
-              </w:rPr>
-              <w:t xml:space="preserve"> </w:t>
-            </w:r>
-            <w:r>
-              <w:rPr>
-                <w:sz w:val="20"/>
-                <w:szCs w:val="20"/>
-              </w:rPr>
-              <w:t>|  Microsoft Excel</w:t>
+              <w:t>SQL  |  Microsoft Excel</w:t>
             </w:r>
           </w:p>
         </w:tc>
@@ -626,7 +605,7 @@
         <w:spacing w:before="80" w:after="100"/>
       </w:pPr>
       <w:r>
-        <w:t>This project investigates Did Not Attend (DNA) rates across NHS GP appointment systems in England, covering July 2022 to December 2024. Using publicly available NHS England data, the analysis addresses three research questions — updated mid-project after preliminary findings challenged the assumptions embedded in the original framing — spanning geographic variation, appointment mode effects, and the relationship between deprivation and missed appointments.</w:t>
+        <w:t>This project investigates Did Not Attend (DNA) rates across NHS GP appointment systems in England, covering July 2022 to December 2024. Using publicly available NHS England data, the analysis addresses three research questions, revised mid-project when preliminary findings challenged the assumptions embedded in the original framing, spanning geographic variation, appointment mode effects, and the relationship between deprivation and missed appointments.</w:t>
       </w:r>
     </w:p>
     <w:p>
@@ -705,7 +684,7 @@
                 <w:sz w:val="20"/>
                 <w:szCs w:val="20"/>
               </w:rPr>
-              <w:t>DNA rates vary significantly across England, with London (12.15%) and the North West (11.84%) emerging as the primary hotspots. The national average of approximately 4.8% conceals a Sub-ICB spread from 0.00% to 32.84% — a 96-location distribution where roughly half of Sub-ICBs exceed 8%.</w:t>
+              <w:t>DNA rates vary significantly across England, with London (12.15%) and the North West (11.84%) emerging as the primary hotspots. The national average of approximately 4.8% conceals a Sub-ICB spread from 0.00% to 32.84%, with roughly half of all 96 Sub-ICBs exceeding 8%.</w:t>
             </w:r>
           </w:p>
           <w:p>
@@ -791,7 +770,7 @@
                 <w:sz w:val="20"/>
                 <w:szCs w:val="20"/>
               </w:rPr>
-              <w:t>Face-to-face appointments carry the highest DNA rate (10.65%) — more than 5 times higher than video/online appointments (1.94%) and nearly twice the telephone rate (5.77%). The post-COVID shift toward remote and digital consultations has not increased missed appointments; it has reduced them.</w:t>
+              <w:t>Face-to-face appointments carry the highest DNA rate (10.65%), more than five times higher than video/online appointments (1.94%) and nearly twice the telephone rate (5.77%). The post-COVID shift toward remote and digital consultations has not increased missed appointments; it has reduced them.</w:t>
             </w:r>
           </w:p>
           <w:p>
@@ -803,7 +782,7 @@
                 <w:sz w:val="20"/>
                 <w:szCs w:val="20"/>
               </w:rPr>
-              <w:t>This pattern is consistent across all seven NHS regions, suggesting a systemic mechanism rather than a regional anomaly. The most plausible explanation is cancellation friction: telephone and digital appointments are easier to quietly ignore, but face-to-face bookings carry a stronger psychological commitment — making a person more likely to cancel rather than simply not attend. Video/online appointments have grown nearly 10-fold since July 2022 (0.58% to 5.54% of all appointments), representing a significant and underutilised lever for reducing DNAs further.</w:t>
+              <w:t>This pattern is consistent across all seven NHS regions, suggesting a systemic mechanism rather than a regional anomaly. The most plausible explanation is cancellation friction: telephone and digital appointments are easier to quietly ignore, but face-to-face bookings carry a stronger psychological commitment, making a person more likely to cancel rather than simply not attend. Video/online appointments have grown nearly 10-fold since July 2022 (0.58% to 5.54% of all appointments), representing a significant and underutilised lever for reducing DNAs further.</w:t>
             </w:r>
           </w:p>
         </w:tc>
@@ -877,7 +856,7 @@
                 <w:sz w:val="20"/>
                 <w:szCs w:val="20"/>
               </w:rPr>
-              <w:t>Contrary to the assumption that underpins much NHS access inequality literature, the least deprived areas (IMD bands 9–10) show the highest average DNA rate in this dataset (7.40%), compared to 6.12% in the most deprived areas analysed (bands 5–6).</w:t>
+              <w:t>A corrected geographic join (ONS LSOA 2011 to Sub-ICB Locations lookup, replacing an approximate name match) now covers all 96 Sub-ICBs and changes the finding materially. The most deprived Sub-ICBs (IMD bands 3–4, 20 areas) show the highest average DNA rate in this dataset at 11.24%. This provides qualified support for the access inequality narrative: Lancashire (13.65%), Greater Manchester (14.88%), and Cheshire (16.93%) all sit in band 3–4 and report DNA rates well above the national average.</w:t>
             </w:r>
           </w:p>
           <w:p>
@@ -889,7 +868,7 @@
                 <w:sz w:val="20"/>
                 <w:szCs w:val="20"/>
               </w:rPr>
-              <w:t>This finding does not mean deprivation is irrelevant to healthcare access; it means deprivation alone is not a reliable predictor of GP DNA rates at Sub-ICB level. The wide range of DNA rates within each deprivation band, combined with the counterintuitive direction of the relationship, strongly suggests that confounding factors — particularly appointment mode mix and urban density — dominate the signal. Commissioners should not assume that deprived areas are the primary source of the DNA problem.</w:t>
+              <w:t>The relationship is non-monotonic, though, and the within-band DNA ranges are very wide across every band. Band 9–10 contains a single Sub-ICB (Buckinghamshire 14Y, 17.35%) which cannot be read as a trend for affluent areas. Appointment mode mix and urban density remain plausible confounders that a controlled analysis would need to disentangle. Commissioners should treat the band 3–4 signal as a hypothesis to investigate, not as grounds for targeting deprived areas without further controlled analysis.</w:t>
             </w:r>
           </w:p>
         </w:tc>
@@ -905,11 +884,7 @@
         <w:spacing w:before="80" w:after="100"/>
       </w:pPr>
       <w:r>
-        <w:t>The analysis concludes with three evidence-based recommendations focused on accelerating the shift to lower-friction appointment modes, targeting resources at the highest-</w:t>
-      </w:r>
-      <w:r>
-        <w:lastRenderedPageBreak/>
-        <w:t>rate regions rather than the most deprived, and commissioning a more granular deprivation analysis that controls for mode mix and urban classification.</w:t>
+        <w:t>Three findings drive the recommendations. The mode-friction effect is real, consistent across all seven regions, and immediately actionable: expanding telephone and digital access reduces DNAs without requiring any change in patient behaviour. The regional concentration in London and the North West justifies targeted rather than uniform policy. And the deprivation signal, while real in the corrected data, is too noisy at Sub-ICB level to drive resource allocation without a controlled analysis accounting for mode mix and booking lead time.</w:t>
       </w:r>
     </w:p>
     <w:p>
@@ -967,7 +942,7 @@
         <w:spacing w:before="80" w:after="100"/>
       </w:pPr>
       <w:r>
-        <w:t>The pandemic triggered a fundamental shift in how GP appointments are delivered — from a predominantly face-to-face model to a mixed model incorporating telephone, video, and online channels. The NHS Long Term Plan explicitly encouraged this shift as part of its primary care access strategy. However, the effect of this mode shift on attendance behaviour has been underexplored in published primary care analytics. A widely held assumption — that remote appointments are harder to attend, and therefore associated with higher DNA rates — has rarely been tested against systematic data.</w:t>
+        <w:t>The pandemic triggered a fundamental shift in how GP appointments are delivered, moving from a predominantly face-to-face model to a mixed one incorporating telephone, video, and online channels. The NHS Long Term Plan explicitly encouraged this shift as part of its primary care access strategy. The effect of this mode shift on attendance behaviour has been underexplored in published primary care analytics. The assumption that remote appointments are harder to attend, and therefore associated with higher DNA rates, had rarely been tested against systematic data.</w:t>
       </w:r>
     </w:p>
     <w:p>
@@ -1367,7 +1342,7 @@
                 <w:sz w:val="20"/>
                 <w:szCs w:val="20"/>
               </w:rPr>
-              <w:t>Is deprivation a reliable predictor of DNA rates, or do other factors — such as appointment mode mix and urban density — confound the relationship?</w:t>
+              <w:t>Is deprivation a reliable predictor of DNA rates, or do other factors (appointment mode mix, urban density) confound the relationship?</w:t>
             </w:r>
           </w:p>
         </w:tc>
@@ -1955,19 +1930,7 @@
         <w:spacing w:before="60" w:after="60"/>
       </w:pPr>
       <w:r>
-        <w:t>SQL (SQLite via DB Browser</w:t>
-      </w:r>
-      <w:r>
-        <w:t>)</w:t>
-      </w:r>
-      <w:r>
-        <w:t xml:space="preserve"> </w:t>
-      </w:r>
-      <w:r>
-        <w:t>for</w:t>
-      </w:r>
-      <w:r>
-        <w:t xml:space="preserve"> data import, cleaning, and all analytical queries</w:t>
+        <w:t>SQL (SQLite via DB Browser) for data import, cleaning, and all analytical queries</w:t>
       </w:r>
     </w:p>
     <w:p>
@@ -1980,13 +1943,7 @@
         <w:spacing w:before="60" w:after="60"/>
       </w:pPr>
       <w:r>
-        <w:t xml:space="preserve">Microsoft Excel </w:t>
-      </w:r>
-      <w:r>
-        <w:t xml:space="preserve">for </w:t>
-      </w:r>
-      <w:r>
-        <w:t>export processing, pivot tables, and dashboard charts</w:t>
+        <w:t>Microsoft Excel for export processing, pivot tables, and dashboard charts</w:t>
       </w:r>
     </w:p>
     <w:p>
@@ -2710,7 +2667,7 @@
           <w:sz w:val="24"/>
           <w:szCs w:val="24"/>
         </w:rPr>
-        <w:t>4.1  Q1 — Regional DNA Rates and Structural Concentration</w:t>
+        <w:t>4.1  Q1 — London and the North West Are Structural Outliers; the National Average Obscures the Scale</w:t>
       </w:r>
     </w:p>
     <w:p>
@@ -2795,7 +2752,7 @@
         <w:spacing w:before="80" w:after="100"/>
       </w:pPr>
       <w:r>
-        <w:t>The national trend line is reassuring at a macro level — there is no systemic national crisis. However, thinking of it as analogous to a national average temperature: a stable national figure can coexist with a dangerous heatwave in one city and sub-zero temperatures in another. The regional picture reveals exactly this pattern.</w:t>
+        <w:t>The national trend line is reassuring at a macro level: there is no systemic national crisis. A useful frame: think of it as analogous to a national average temperature: a stable national figure can coexist with a dangerous heatwave in one city and sub-zero temperatures in another. The regional picture reveals exactly this pattern.</w:t>
       </w:r>
     </w:p>
     <w:p>
@@ -2877,7 +2834,7 @@
         <w:spacing w:before="60" w:after="60"/>
       </w:pPr>
       <w:r>
-        <w:t>London: 12.15% — 513,023 DNAs from 4,223,020 appointments. The highest rate by a wide margin and 2.7× above South West.</w:t>
+        <w:t>London: 12.15% (513,023 DNAs from 4,223,020 appointments). The highest rate by a wide margin and 2.7× above South West.</w:t>
       </w:r>
     </w:p>
     <w:p>
@@ -2890,7 +2847,7 @@
         <w:spacing w:before="60" w:after="60"/>
       </w:pPr>
       <w:r>
-        <w:t>North West: 11.84% — 182,335 DNAs from 1,540,415 appointments. Close behind London and host to five of the top ten worst Sub-ICBs nationally.</w:t>
+        <w:t>North West: 11.84% (182,335 DNAs from 1,540,415 appointments). Close behind London and host to five of the top ten worst Sub-ICBs nationally.</w:t>
       </w:r>
     </w:p>
     <w:p>
@@ -2903,7 +2860,7 @@
         <w:spacing w:before="60" w:after="60"/>
       </w:pPr>
       <w:r>
-        <w:t>Midlands: 8.71% — substantially above the national average, with significant internal variation.</w:t>
+        <w:t>Midlands: 8.71%, substantially above the national average, with significant internal variation.</w:t>
       </w:r>
     </w:p>
     <w:p>
@@ -2917,7 +2874,7 @@
       </w:pPr>
       <w:r>
         <w:lastRenderedPageBreak/>
-        <w:t>South West: 4.51% — the best performing region, notable given it contains the nationally outlying Sub-ICB in Bristol (21.84%).</w:t>
+        <w:t>South West: 4.51%, the best performing region, notable given it contains the nationally outlying Sub-ICB in Bristol (21.84%).</w:t>
       </w:r>
     </w:p>
     <w:p>
@@ -5599,7 +5556,7 @@
           <w:szCs w:val="24"/>
         </w:rPr>
         <w:lastRenderedPageBreak/>
-        <w:t>4.2  Q2 — Appointment Friction and DNA Rates</w:t>
+        <w:t>4.2  Q2 — Face-to-Face Has the Highest DNA Rate; the Mode Shift Has Helped Attendance, Not Hurt It</w:t>
       </w:r>
     </w:p>
     <w:p>
@@ -5607,7 +5564,7 @@
         <w:spacing w:before="80" w:after="100"/>
       </w:pPr>
       <w:r>
-        <w:t>The single strongest finding in this analysis is the relationship between appointment mode and DNA rate. Face-to-face appointments have a DNA rate of 10.65% — 1.8× higher than telephone (5.77%), 4× higher than home visits (2.68%), and 5.5× higher than video/online appointments (1.94%).</w:t>
+        <w:t>The single strongest finding in this analysis is the relationship between appointment mode and DNA rate. Face-to-face appointments have a DNA rate of 10.65%: 1.8× higher than telephone (5.77%), 4× higher than home visits (2.68%), and 5.5× higher than video/online appointments (1.94%).</w:t>
       </w:r>
     </w:p>
     <w:p>
@@ -5697,7 +5654,7 @@
           <w:bCs/>
           <w:color w:val="005EB8"/>
         </w:rPr>
-        <w:t>The Cancellation Friction Mechanism</w:t>
+        <w:t>Cancellation Friction, Not Travel Cost, Best Explains the Pattern</w:t>
       </w:r>
     </w:p>
     <w:p>
@@ -5705,7 +5662,7 @@
         <w:spacing w:before="80" w:after="100"/>
       </w:pPr>
       <w:r>
-        <w:t>The most coherent explanation is not that face-to-face appointments are harder to get to (the 'travel cost' hypothesis), but that they are harder to silently abandon. A face-to-face booking carries an implicit social contract — missing it requires a conscious choice to leave a slot empty, whereas a telephone or video appointment can be quietly ignored without the same psychological barrier.</w:t>
+        <w:t>The most coherent explanation is not that face-to-face appointments are harder to get to (the 'travel cost' hypothesis), but that they are harder to silently abandon. A face-to-face booking carries an implicit social contract: missing it requires a conscious choice to leave a slot empty, whereas a telephone or video appointment can be quietly ignored without the same psychological barrier.</w:t>
       </w:r>
     </w:p>
     <w:p>
@@ -5721,7 +5678,7 @@
         <w:spacing w:before="80" w:after="100"/>
       </w:pPr>
       <w:r>
-        <w:t>The travel cost hypothesis — that patients in less affluent areas cannot afford bus fares or fuel — is also challenged by the deprivation data (Section 4.3), which shows that the least deprived areas have higher DNA rates. If transport cost were the primary driver, the pattern would be inverted.</w:t>
+        <w:t>The travel cost hypothesis (that patients in less affluent areas cannot afford bus fares or fuel) is not straightforwardly supported by the deprivation data (Section 4.3). The corrected analysis shows that the most deprived Sub-ICBs do have higher average DNA rates, which is at least consistent with a travel cost effect. The relationship is non-monotonic, though, and within-band variation is so large that travel cost alone cannot account for the pattern observed. Appointment mode mix and urban density remain stronger candidates as primary structural drivers.</w:t>
       </w:r>
     </w:p>
     <w:p>
@@ -5791,7 +5748,7 @@
           <w:sz w:val="18"/>
           <w:szCs w:val="18"/>
         </w:rPr>
-        <w:t>Figure 5 — Face-to-face vs telephone DNA rate by region. F2F consistently exceeds telephone in every region. Note the North West's telephone DNA rate (8.60%) — higher than the face-to-face rate in South West (5.76%) — which shows that regional factors compound the mode effect.</w:t>
+        <w:t>Figure 5 — Face-to-face vs telephone DNA rate by region. F2F consistently exceeds telephone in every region. The North West's telephone DNA rate (8.60%) exceeds the face-to-face rate in the South West (5.76%), showing that regional factors compound the mode effect.</w:t>
       </w:r>
     </w:p>
     <w:p>
@@ -5804,7 +5761,7 @@
           <w:bCs/>
           <w:color w:val="005EB8"/>
         </w:rPr>
-        <w:t>Mode Mix Shift and the Digital Opportunity</w:t>
+        <w:t>The Mode Shift Has Already Cut DNAs — Digital Growth Is an Untapped Lever</w:t>
       </w:r>
     </w:p>
     <w:p>
@@ -5955,7 +5912,7 @@
         <w:spacing w:before="60" w:after="60"/>
       </w:pPr>
       <w:r>
-        <w:t>Video/online appointments grew from 0.58% of all appointments (Jul 2022) to 5.54% (Dec 2024) — a near 10× increase in 2.5 years.</w:t>
+        <w:t>Video/online appointments grew from 0.58% of all appointments (Jul 2022) to 5.54% by December 2024, a near 10-fold increase in 2.5 years.</w:t>
       </w:r>
     </w:p>
     <w:p>
@@ -5982,7 +5939,7 @@
         <w:spacing w:before="60" w:after="60"/>
       </w:pPr>
       <w:r>
-        <w:t>If video/online share doubled from 5.54% to 11%, and face-to-face fell commensurately, the blended national DNA rate would drop by an estimated 0.3–0.5 percentage points — equivalent to tens of thousands of avoided missed appointments annually.</w:t>
+        <w:t>If video/online share doubled from 5.54% to 11%, and face-to-face fell commensurately, the blended national DNA rate would drop by an estimated 0.3–0.5 percentage points, equivalent to tens of thousands of avoided missed appointments annually.</w:t>
       </w:r>
     </w:p>
     <w:p>
@@ -6006,7 +5963,7 @@
           <w:szCs w:val="24"/>
         </w:rPr>
         <w:lastRenderedPageBreak/>
-        <w:t>4.3  Q3 — Deprivation as a Predictor of DNA Rates</w:t>
+        <w:t>4.3  Q3 — Deprived Areas Have Higher DNA Rates; the Signal Is Real but Too Noisy to Drive Targeting Without Controlled Analysis</w:t>
       </w:r>
     </w:p>
     <w:p>
@@ -6014,7 +5971,7 @@
         <w:spacing w:before="80" w:after="100"/>
       </w:pPr>
       <w:r>
-        <w:t>The original framing of this question assumed a positive relationship between deprivation and DNA rates — consistent with the existing literature on healthcare access barriers. The data does not support this assumption at Sub-ICB level.</w:t>
+        <w:t>The original framing of this question assumed a positive relationship between deprivation and DNA rates, consistent with the existing literature on healthcare access barriers. The corrected analysis, using the ONS LSOA (2011) to Sub-ICB Locations lookup rather than an approximate name match, now covers all 96 Sub-ICBs and produces a materially different result from an earlier draft of this analysis.</w:t>
       </w:r>
     </w:p>
     <w:p>
@@ -6083,7 +6040,7 @@
           <w:sz w:val="18"/>
           <w:szCs w:val="18"/>
         </w:rPr>
-        <w:t>Figure 8 — DNA rate by deprivation band. Dots represent average DNA rates; vertical bars show the min-to-max range within each band. The least deprived areas have the highest average, but all bands show wide internal ranges.</w:t>
+        <w:t>Figure 8 — DNA rate by deprivation band (corrected LSOA join, all 96 Sub-ICBs). The most deprived Sub-ICBs (band 3–4) have the highest average DNA rate at 11.24%. Note: band 9–10 contains a single Sub-ICB (Buckinghamshire 14Y, 17.35%) and should be treated as a data point rather than a band average.</w:t>
       </w:r>
     </w:p>
     <w:tbl>
@@ -6291,7 +6248,7 @@
                 <w:sz w:val="20"/>
                 <w:szCs w:val="20"/>
               </w:rPr>
-              <w:t>Bands 5–6  (More Deprived)</w:t>
+              <w:t>Bands 3–4  (Most Deprived)</w:t>
             </w:r>
           </w:p>
         </w:tc>
@@ -6318,7 +6275,7 @@
                 <w:sz w:val="20"/>
                 <w:szCs w:val="20"/>
               </w:rPr>
-              <w:t>7</w:t>
+              <w:t>20</w:t>
             </w:r>
           </w:p>
         </w:tc>
@@ -6332,6 +6289,143 @@
               <w:right w:val="single" w:sz="1" w:space="0" w:color="CDD5DF"/>
             </w:tcBorders>
             <w:shd w:val="clear" w:color="auto" w:fill="EEF4FB"/>
+            <w:tcMar>
+              <w:top w:w="80" w:type="dxa"/>
+              <w:left w:w="140" w:type="dxa"/>
+              <w:bottom w:w="80" w:type="dxa"/>
+              <w:right w:w="140" w:type="dxa"/>
+            </w:tcMar>
+          </w:tcPr>
+          <w:p>
+            <w:r>
+              <w:rPr>
+                <w:b/>
+                <w:bCs/>
+                <w:color w:val="DA291C"/>
+                <w:sz w:val="20"/>
+                <w:szCs w:val="20"/>
+              </w:rPr>
+              <w:t>11.24%</w:t>
+            </w:r>
+          </w:p>
+        </w:tc>
+        <w:tc>
+          <w:tcPr>
+            <w:tcW w:w="1600" w:type="dxa"/>
+            <w:tcBorders>
+              <w:top w:val="single" w:sz="1" w:space="0" w:color="CDD5DF"/>
+              <w:left w:val="single" w:sz="1" w:space="0" w:color="CDD5DF"/>
+              <w:bottom w:val="single" w:sz="1" w:space="0" w:color="CDD5DF"/>
+              <w:right w:val="single" w:sz="1" w:space="0" w:color="CDD5DF"/>
+            </w:tcBorders>
+            <w:shd w:val="clear" w:color="auto" w:fill="EEF4FB"/>
+            <w:tcMar>
+              <w:top w:w="80" w:type="dxa"/>
+              <w:left w:w="140" w:type="dxa"/>
+              <w:bottom w:w="80" w:type="dxa"/>
+              <w:right w:w="140" w:type="dxa"/>
+            </w:tcMar>
+          </w:tcPr>
+          <w:p>
+            <w:r>
+              <w:rPr>
+                <w:sz w:val="20"/>
+                <w:szCs w:val="20"/>
+              </w:rPr>
+              <w:t>4.78%</w:t>
+            </w:r>
+          </w:p>
+        </w:tc>
+        <w:tc>
+          <w:tcPr>
+            <w:tcW w:w="2026" w:type="dxa"/>
+            <w:tcBorders>
+              <w:top w:val="single" w:sz="1" w:space="0" w:color="CDD5DF"/>
+              <w:left w:val="single" w:sz="1" w:space="0" w:color="CDD5DF"/>
+              <w:bottom w:val="single" w:sz="1" w:space="0" w:color="CDD5DF"/>
+              <w:right w:val="single" w:sz="1" w:space="0" w:color="CDD5DF"/>
+            </w:tcBorders>
+            <w:shd w:val="clear" w:color="auto" w:fill="EEF4FB"/>
+            <w:tcMar>
+              <w:top w:w="80" w:type="dxa"/>
+              <w:left w:w="140" w:type="dxa"/>
+              <w:bottom w:w="80" w:type="dxa"/>
+              <w:right w:w="140" w:type="dxa"/>
+            </w:tcMar>
+          </w:tcPr>
+          <w:p>
+            <w:r>
+              <w:rPr>
+                <w:sz w:val="20"/>
+                <w:szCs w:val="20"/>
+              </w:rPr>
+              <w:t>16.93%</w:t>
+            </w:r>
+          </w:p>
+        </w:tc>
+      </w:tr>
+      <w:tr>
+        <w:tc>
+          <w:tcPr>
+            <w:tcW w:w="2600" w:type="dxa"/>
+            <w:tcBorders>
+              <w:top w:val="single" w:sz="1" w:space="0" w:color="CDD5DF"/>
+              <w:left w:val="single" w:sz="1" w:space="0" w:color="CDD5DF"/>
+              <w:bottom w:val="single" w:sz="1" w:space="0" w:color="CDD5DF"/>
+              <w:right w:val="single" w:sz="1" w:space="0" w:color="CDD5DF"/>
+            </w:tcBorders>
+            <w:tcMar>
+              <w:top w:w="80" w:type="dxa"/>
+              <w:left w:w="140" w:type="dxa"/>
+              <w:bottom w:w="80" w:type="dxa"/>
+              <w:right w:w="140" w:type="dxa"/>
+            </w:tcMar>
+          </w:tcPr>
+          <w:p>
+            <w:r>
+              <w:rPr>
+                <w:sz w:val="20"/>
+                <w:szCs w:val="20"/>
+              </w:rPr>
+              <w:t>Bands 5–6  (Mid)</w:t>
+            </w:r>
+          </w:p>
+        </w:tc>
+        <w:tc>
+          <w:tcPr>
+            <w:tcW w:w="1400" w:type="dxa"/>
+            <w:tcBorders>
+              <w:top w:val="single" w:sz="1" w:space="0" w:color="CDD5DF"/>
+              <w:left w:val="single" w:sz="1" w:space="0" w:color="CDD5DF"/>
+              <w:bottom w:val="single" w:sz="1" w:space="0" w:color="CDD5DF"/>
+              <w:right w:val="single" w:sz="1" w:space="0" w:color="CDD5DF"/>
+            </w:tcBorders>
+            <w:tcMar>
+              <w:top w:w="80" w:type="dxa"/>
+              <w:left w:w="140" w:type="dxa"/>
+              <w:bottom w:w="80" w:type="dxa"/>
+              <w:right w:w="140" w:type="dxa"/>
+            </w:tcMar>
+          </w:tcPr>
+          <w:p>
+            <w:r>
+              <w:rPr>
+                <w:sz w:val="20"/>
+                <w:szCs w:val="20"/>
+              </w:rPr>
+              <w:t>43</w:t>
+            </w:r>
+          </w:p>
+        </w:tc>
+        <w:tc>
+          <w:tcPr>
+            <w:tcW w:w="1400" w:type="dxa"/>
+            <w:tcBorders>
+              <w:top w:val="single" w:sz="1" w:space="0" w:color="CDD5DF"/>
+              <w:left w:val="single" w:sz="1" w:space="0" w:color="CDD5DF"/>
+              <w:bottom w:val="single" w:sz="1" w:space="0" w:color="CDD5DF"/>
+              <w:right w:val="single" w:sz="1" w:space="0" w:color="CDD5DF"/>
+            </w:tcBorders>
             <w:tcMar>
               <w:top w:w="80" w:type="dxa"/>
               <w:left w:w="140" w:type="dxa"/>
@@ -6348,7 +6442,7 @@
                 <w:sz w:val="20"/>
                 <w:szCs w:val="20"/>
               </w:rPr>
-              <w:t>6.12%</w:t>
+              <w:t>8.10%</w:t>
             </w:r>
           </w:p>
         </w:tc>
@@ -6361,21 +6455,20 @@
               <w:bottom w:val="single" w:sz="1" w:space="0" w:color="CDD5DF"/>
               <w:right w:val="single" w:sz="1" w:space="0" w:color="CDD5DF"/>
             </w:tcBorders>
-            <w:shd w:val="clear" w:color="auto" w:fill="EEF4FB"/>
-            <w:tcMar>
-              <w:top w:w="80" w:type="dxa"/>
-              <w:left w:w="140" w:type="dxa"/>
-              <w:bottom w:w="80" w:type="dxa"/>
-              <w:right w:w="140" w:type="dxa"/>
-            </w:tcMar>
-          </w:tcPr>
-          <w:p>
-            <w:r>
-              <w:rPr>
-                <w:sz w:val="20"/>
-                <w:szCs w:val="20"/>
-              </w:rPr>
-              <w:t>5.71%</w:t>
+            <w:tcMar>
+              <w:top w:w="80" w:type="dxa"/>
+              <w:left w:w="140" w:type="dxa"/>
+              <w:bottom w:w="80" w:type="dxa"/>
+              <w:right w:w="140" w:type="dxa"/>
+            </w:tcMar>
+          </w:tcPr>
+          <w:p>
+            <w:r>
+              <w:rPr>
+                <w:sz w:val="20"/>
+                <w:szCs w:val="20"/>
+              </w:rPr>
+              <w:t>0.00%</w:t>
             </w:r>
           </w:p>
         </w:tc>
@@ -6388,21 +6481,20 @@
               <w:bottom w:val="single" w:sz="1" w:space="0" w:color="CDD5DF"/>
               <w:right w:val="single" w:sz="1" w:space="0" w:color="CDD5DF"/>
             </w:tcBorders>
-            <w:shd w:val="clear" w:color="auto" w:fill="EEF4FB"/>
-            <w:tcMar>
-              <w:top w:w="80" w:type="dxa"/>
-              <w:left w:w="140" w:type="dxa"/>
-              <w:bottom w:w="80" w:type="dxa"/>
-              <w:right w:w="140" w:type="dxa"/>
-            </w:tcMar>
-          </w:tcPr>
-          <w:p>
-            <w:r>
-              <w:rPr>
-                <w:sz w:val="20"/>
-                <w:szCs w:val="20"/>
-              </w:rPr>
-              <w:t>6.37%</w:t>
+            <w:tcMar>
+              <w:top w:w="80" w:type="dxa"/>
+              <w:left w:w="140" w:type="dxa"/>
+              <w:bottom w:w="80" w:type="dxa"/>
+              <w:right w:w="140" w:type="dxa"/>
+            </w:tcMar>
+          </w:tcPr>
+          <w:p>
+            <w:r>
+              <w:rPr>
+                <w:sz w:val="20"/>
+                <w:szCs w:val="20"/>
+              </w:rPr>
+              <w:t>14.67%</w:t>
             </w:r>
           </w:p>
         </w:tc>
@@ -6417,20 +6509,21 @@
               <w:bottom w:val="single" w:sz="1" w:space="0" w:color="CDD5DF"/>
               <w:right w:val="single" w:sz="1" w:space="0" w:color="CDD5DF"/>
             </w:tcBorders>
-            <w:tcMar>
-              <w:top w:w="80" w:type="dxa"/>
-              <w:left w:w="140" w:type="dxa"/>
-              <w:bottom w:w="80" w:type="dxa"/>
-              <w:right w:w="140" w:type="dxa"/>
-            </w:tcMar>
-          </w:tcPr>
-          <w:p>
-            <w:r>
-              <w:rPr>
-                <w:sz w:val="20"/>
-                <w:szCs w:val="20"/>
-              </w:rPr>
-              <w:t>Bands 7–8  (Mid)</w:t>
+            <w:shd w:val="clear" w:color="auto" w:fill="FEF6F5"/>
+            <w:tcMar>
+              <w:top w:w="80" w:type="dxa"/>
+              <w:left w:w="140" w:type="dxa"/>
+              <w:bottom w:w="80" w:type="dxa"/>
+              <w:right w:w="140" w:type="dxa"/>
+            </w:tcMar>
+          </w:tcPr>
+          <w:p>
+            <w:r>
+              <w:rPr>
+                <w:sz w:val="20"/>
+                <w:szCs w:val="20"/>
+              </w:rPr>
+              <w:t>Bands 7–8</w:t>
             </w:r>
           </w:p>
         </w:tc>
@@ -6443,20 +6536,21 @@
               <w:bottom w:val="single" w:sz="1" w:space="0" w:color="CDD5DF"/>
               <w:right w:val="single" w:sz="1" w:space="0" w:color="CDD5DF"/>
             </w:tcBorders>
-            <w:tcMar>
-              <w:top w:w="80" w:type="dxa"/>
-              <w:left w:w="140" w:type="dxa"/>
-              <w:bottom w:w="80" w:type="dxa"/>
-              <w:right w:w="140" w:type="dxa"/>
-            </w:tcMar>
-          </w:tcPr>
-          <w:p>
-            <w:r>
-              <w:rPr>
-                <w:sz w:val="20"/>
-                <w:szCs w:val="20"/>
-              </w:rPr>
-              <w:t>6</w:t>
+            <w:shd w:val="clear" w:color="auto" w:fill="FEF6F5"/>
+            <w:tcMar>
+              <w:top w:w="80" w:type="dxa"/>
+              <w:left w:w="140" w:type="dxa"/>
+              <w:bottom w:w="80" w:type="dxa"/>
+              <w:right w:w="140" w:type="dxa"/>
+            </w:tcMar>
+          </w:tcPr>
+          <w:p>
+            <w:r>
+              <w:rPr>
+                <w:sz w:val="20"/>
+                <w:szCs w:val="20"/>
+              </w:rPr>
+              <w:t>32</w:t>
             </w:r>
           </w:p>
         </w:tc>
@@ -6469,6 +6563,7 @@
               <w:bottom w:val="single" w:sz="1" w:space="0" w:color="CDD5DF"/>
               <w:right w:val="single" w:sz="1" w:space="0" w:color="CDD5DF"/>
             </w:tcBorders>
+            <w:shd w:val="clear" w:color="auto" w:fill="FEF6F5"/>
             <w:tcMar>
               <w:top w:w="80" w:type="dxa"/>
               <w:left w:w="140" w:type="dxa"/>
@@ -6485,7 +6580,7 @@
                 <w:sz w:val="20"/>
                 <w:szCs w:val="20"/>
               </w:rPr>
-              <w:t>6.35%</w:t>
+              <w:t>8.83%</w:t>
             </w:r>
           </w:p>
         </w:tc>
@@ -6498,20 +6593,21 @@
               <w:bottom w:val="single" w:sz="1" w:space="0" w:color="CDD5DF"/>
               <w:right w:val="single" w:sz="1" w:space="0" w:color="CDD5DF"/>
             </w:tcBorders>
-            <w:tcMar>
-              <w:top w:w="80" w:type="dxa"/>
-              <w:left w:w="140" w:type="dxa"/>
-              <w:bottom w:w="80" w:type="dxa"/>
-              <w:right w:w="140" w:type="dxa"/>
-            </w:tcMar>
-          </w:tcPr>
-          <w:p>
-            <w:r>
-              <w:rPr>
-                <w:sz w:val="20"/>
-                <w:szCs w:val="20"/>
-              </w:rPr>
-              <w:t>3.35%</w:t>
+            <w:shd w:val="clear" w:color="auto" w:fill="FEF6F5"/>
+            <w:tcMar>
+              <w:top w:w="80" w:type="dxa"/>
+              <w:left w:w="140" w:type="dxa"/>
+              <w:bottom w:w="80" w:type="dxa"/>
+              <w:right w:w="140" w:type="dxa"/>
+            </w:tcMar>
+          </w:tcPr>
+          <w:p>
+            <w:r>
+              <w:rPr>
+                <w:sz w:val="20"/>
+                <w:szCs w:val="20"/>
+              </w:rPr>
+              <w:t>0.00%</w:t>
             </w:r>
           </w:p>
         </w:tc>
@@ -6524,20 +6620,21 @@
               <w:bottom w:val="single" w:sz="1" w:space="0" w:color="CDD5DF"/>
               <w:right w:val="single" w:sz="1" w:space="0" w:color="CDD5DF"/>
             </w:tcBorders>
-            <w:tcMar>
-              <w:top w:w="80" w:type="dxa"/>
-              <w:left w:w="140" w:type="dxa"/>
-              <w:bottom w:w="80" w:type="dxa"/>
-              <w:right w:w="140" w:type="dxa"/>
-            </w:tcMar>
-          </w:tcPr>
-          <w:p>
-            <w:r>
-              <w:rPr>
-                <w:sz w:val="20"/>
-                <w:szCs w:val="20"/>
-              </w:rPr>
-              <w:t>11.30%</w:t>
+            <w:shd w:val="clear" w:color="auto" w:fill="FEF6F5"/>
+            <w:tcMar>
+              <w:top w:w="80" w:type="dxa"/>
+              <w:left w:w="140" w:type="dxa"/>
+              <w:bottom w:w="80" w:type="dxa"/>
+              <w:right w:w="140" w:type="dxa"/>
+            </w:tcMar>
+          </w:tcPr>
+          <w:p>
+            <w:r>
+              <w:rPr>
+                <w:sz w:val="20"/>
+                <w:szCs w:val="20"/>
+              </w:rPr>
+              <w:t>32.84%</w:t>
             </w:r>
           </w:p>
         </w:tc>
@@ -6593,7 +6690,7 @@
                 <w:sz w:val="20"/>
                 <w:szCs w:val="20"/>
               </w:rPr>
-              <w:t>4</w:t>
+              <w:t>1</w:t>
             </w:r>
           </w:p>
         </w:tc>
@@ -6623,7 +6720,7 @@
                 <w:sz w:val="20"/>
                 <w:szCs w:val="20"/>
               </w:rPr>
-              <w:t>7.40%</w:t>
+              <w:t>17.35%</w:t>
             </w:r>
           </w:p>
         </w:tc>
@@ -6650,7 +6747,7 @@
                 <w:sz w:val="20"/>
                 <w:szCs w:val="20"/>
               </w:rPr>
-              <w:t>3.30%</w:t>
+              <w:t>17.35%</w:t>
             </w:r>
           </w:p>
         </w:tc>
@@ -6677,7 +6774,7 @@
                 <w:sz w:val="20"/>
                 <w:szCs w:val="20"/>
               </w:rPr>
-              <w:t>11.30%</w:t>
+              <w:t>17.35%</w:t>
             </w:r>
           </w:p>
         </w:tc>
@@ -6696,7 +6793,7 @@
           <w:sz w:val="18"/>
           <w:szCs w:val="18"/>
         </w:rPr>
-        <w:t>Table 3 — DNA rate by IMD deprivation band. Counterintuitively, the least deprived band has the highest average DNA rate. The wide min-max ranges within each band indicate limited predictive power.</w:t>
+        <w:t>Table 3 — DNA rate by IMD deprivation band (corrected LSOA join, all 96 Sub-ICBs). The most deprived band (3–4) has the highest average DNA rate at 11.24%. Band 9–10 contains one Sub-ICB only (Buckinghamshire 14Y, 17.35%) and should not be read as a band average. The very wide within-band DNA ranges across all bands indicate that deprivation is an imperfect predictor at Sub-ICB level.</w:t>
       </w:r>
     </w:p>
     <w:p>
@@ -6709,13 +6806,7 @@
         <w:spacing w:before="80" w:after="100"/>
       </w:pPr>
       <w:r>
-        <w:t>Three observations temper a strong conclusion here. First, the sample sizes per band are small (4–7 areas), making averages sensitive to individual outliers. Second, the min-to-max ranges are very wide — particularly in bands 7–8 and 9–10 (both ranging from ~3% to 11%)</w:t>
-      </w:r>
-      <w:r>
-        <w:t>,</w:t>
-      </w:r>
-      <w:r>
-        <w:t xml:space="preserve"> suggesting that the average is not representative of the typical area within each band. Third, the deprivation join is a text-based approximation (see Limitations, Section 5), introducing imprecision.</w:t>
+        <w:t>The corrected data provides partial support for the access inequality hypothesis. The most deprived Sub-ICBs (band 3–4, 20 areas) have the highest average DNA rate at 11.24%, and this band includes some of England's most recognisable high-deprivation areas: Lancashire (13.65%), Greater Manchester (14.88%), and Cheshire (16.93%). Three qualifications prevent a simple interpretation. First, the pattern is non-monotonic: band 7–8 (8.83%) has a higher average than band 5–6 (8.10%), indicating that deprivation alone cannot predict DNA rates in a linear fashion. Second, the within-band ranges are very wide in every band: band 7–8 spans 0.00% to 32.84%, meaning the band average is not representative of any specific Sub-ICB. Third, band 9–10 contains a single Sub-ICB (Buckinghamshire 14Y, 17.35%), which cannot be interpreted as a broader trend for more affluent areas.</w:t>
       </w:r>
     </w:p>
     <w:p>
@@ -6723,19 +6814,7 @@
         <w:spacing w:before="80" w:after="100"/>
       </w:pPr>
       <w:r>
-        <w:t>What the data does clearly show is that deprivation cannot be used as a reliable proxy for identifying high-DNA Sub-ICBs. The highest-DNA Sub-ICBs (London, North West) are not the most deprived, and some of the best performers are in areas of mixed deprivation. Commissioners should treat this as a prompt for more granular investigation</w:t>
-      </w:r>
-      <w:r>
-        <w:t>,</w:t>
-      </w:r>
-      <w:r>
-        <w:t xml:space="preserve"> controlling for mode mix, urban/rural classification, and practice-level variation</w:t>
-      </w:r>
-      <w:r>
-        <w:t>,</w:t>
-      </w:r>
-      <w:r>
-        <w:t xml:space="preserve"> rather than as confirmation of an access inequality narrative.</w:t>
+        <w:t>What the corrected data shows is that the most deprived Sub-ICBs do tend toward higher DNA rates, lending qualified support to the access inequality narrative. But the relationship is imperfect. The highest-DNA Sub-ICBs are concentrated in London and the North West, driven by urban density, transient populations, and same-day triage mode mix, not deprivation alone. No commissioning decision should rest on this deprivation signal without first controlling for appointment mode mix, urban classification, and booking lead time. These confounds likely explain a substantial share of the DNA difference between bands.</w:t>
       </w:r>
     </w:p>
     <w:p>
@@ -6790,7 +6869,7 @@
         <w:spacing w:before="60" w:after="60"/>
       </w:pPr>
       <w:r>
-        <w:t>The deprivation analysis joins Sub-ICB DNA rates to Local Authority level IMD scores using a text-based name match. This is an approximation — Sub-ICB and Local Authority boundaries do not map perfectly. A more precise analysis would use an NHS-published LSOA-to-Sub-ICB lookup table.</w:t>
+        <w:t>The deprivation analysis was re-run during this project after the initial version used an approximate text-based match between Sub-ICB and Local Authority names, which produced materially incorrect results. The final analysis uses the ONS LSOA (2011) to Sub-ICB Locations (July 2022) lookup, joining 32,844 LSOAs to Sub-ICB codes via LSOA11CD → SICBL22CDH and covering all 96 Sub-ICBs. A residual structural limitation is that band 9–10 represents a single Sub-ICB (Buckinghamshire 14Y) and cannot be generalised. Appointment booking lead time is a confound not captured in this dataset: same-day triage telephone slots and advance-booked face-to-face appointments have structurally different DNA dynamics, and a high face-to-face DNA rate may partly reflect a practice's booking model rather than patient behaviour. Patient selection into appointment mode (clinically complex patients are typically directed to face-to-face) further complicates mode-level comparison. This analysis covers primary care only and should not be extrapolated to secondary care settings.</w:t>
       </w:r>
     </w:p>
     <w:p>
@@ -6987,7 +7066,7 @@
         <w:spacing w:before="80" w:after="100"/>
       </w:pPr>
       <w:r>
-        <w:t>London (12.15%) and North West (11.84%) together account for a disproportionate share of national DNAs. Within the North West, five of the ten worst Sub-ICBs are geographically concentrated — Greater Manchester, Lancashire, and Cheshire clusters — suggesting systemic regional factors rather than isolated GP-level issues.</w:t>
+        <w:t>London (12.15%) and North West (11.84%) together account for a disproportionate share of national DNAs. Within the North West, five of the ten worst Sub-ICBs cluster in Greater Manchester, Lancashire, and Cheshire, suggesting systemic regional factors rather than isolated GP-level issues.</w:t>
       </w:r>
     </w:p>
     <w:p>
@@ -7026,13 +7105,7 @@
         <w:spacing w:before="60" w:after="60"/>
       </w:pPr>
       <w:r>
-        <w:t>Best-practice sharing between the lowest-performing and highest-performing Sub-ICBs should be facilitated</w:t>
-      </w:r>
-      <w:r>
-        <w:t>,</w:t>
-      </w:r>
-      <w:r>
-        <w:t xml:space="preserve"> particularly learning from the East of England (6.75% average, with several Sub-ICBs below 3.5%).</w:t>
+        <w:t>Best-practice sharing between the lowest-performing and highest-performing Sub-ICBs should be facilitated, particularly learning from the East of England (6.75% average, with several Sub-ICBs below 3.5%).</w:t>
       </w:r>
     </w:p>
     <w:p>
@@ -7050,7 +7123,7 @@
           <w:sz w:val="24"/>
           <w:szCs w:val="24"/>
         </w:rPr>
-        <w:t>6.3  Commission a Controlled Deprivation Analysis Before Targeting Deprived Areas</w:t>
+        <w:t>6.3  Use the Deprivation Signal, But Validate With Controlled Analysis Before Acting</w:t>
       </w:r>
     </w:p>
     <w:p>
@@ -7058,7 +7131,7 @@
         <w:spacing w:before="80" w:after="100"/>
       </w:pPr>
       <w:r>
-        <w:t>The finding that deprivation does not reliably predict DNA rates at Sub-ICB level should be treated as a prompt to investigate further rather than to abandon the access inequality hypothesis entirely.</w:t>
+        <w:t>The corrected analysis shows that the most deprived Sub-ICBs do have the highest average DNA rate: band 3–4 averages 11.24%, with recognisable high-deprivation clusters in Lancashire, Greater Manchester, and Cheshire all reporting rates above 13%. This provides a more credible basis for targeted commissioning than an earlier draft of this analysis suggested. The relationship is non-monotonic, though, and within-band variation is too wide to support direct targeting without further controlled analysis.</w:t>
       </w:r>
     </w:p>
     <w:p>
@@ -7071,19 +7144,7 @@
         <w:spacing w:before="60" w:after="60"/>
       </w:pPr>
       <w:r>
-        <w:t>NHS England should commission a more granular deprivation analysis that controls for appointment mode mix, urban/rural classification, and practice size</w:t>
-      </w:r>
-      <w:r>
-        <w:t>.</w:t>
-      </w:r>
-      <w:r>
-        <w:t xml:space="preserve"> </w:t>
-      </w:r>
-      <w:r>
-        <w:t>T</w:t>
-      </w:r>
-      <w:r>
-        <w:t>he confounders most likely to be driving the counterintuitive pattern observed here.</w:t>
+        <w:t>The band 3–4 Sub-ICBs in Lancashire, Greater Manchester, and Cheshire sit in the top quartile for both deprivation and DNA rate and are plausible targets for mode-shift interventions, alongside the broader London and North West focus recommended in Section 6.1. Before committing resources on the basis of this deprivation signal, NHS England should commission a controlled analysis accounting for appointment mode mix, urban/rural classification, and booking lead time. The current data is sufficient to form a hypothesis; it is not sufficient to act on it without that further step.</w:t>
       </w:r>
     </w:p>
     <w:p>
@@ -7096,7 +7157,7 @@
         <w:spacing w:before="60" w:after="60"/>
       </w:pPr>
       <w:r>
-        <w:t>DNA rate disaggregated by IMD decile should be added to NHS England's routine primary care performance monitoring framework, but only once the mode-mix confounder is adequately controlled. Publishing raw DNA-by-deprivation data without this adjustment risks misdirecting commissioner attention toward deprived areas that are not the primary source of the problem.</w:t>
+        <w:t>DNA rate disaggregated by IMD decile should be added to NHS England's routine primary care performance monitoring framework, but only alongside appointment mode mix data. Publishing raw DNA-by-deprivation figures without mode adjustment risks misattributing what is partly a structural booking and friction problem to patient behaviour in deprived areas.</w:t>
       </w:r>
     </w:p>
     <w:p>

</xml_diff>